<commit_message>
Last version of documents, specially ProyectoMagisterHaroldGomez.docx
</commit_message>
<xml_diff>
--- a/Docs/Octubre2025/Words/First.docx
+++ b/Docs/Octubre2025/Words/First.docx
@@ -454,6 +454,7 @@
       <w:pPr>
         <w:sectPr>
           <w:headerReference w:type="default" r:id="rId8"/>
+          <w:footerReference w:type="even" r:id="rId9"/>
           <w:pgSz w:w="12240" w:h="15840"/>
           <w:pgMar w:top="2127" w:right="1418" w:bottom="1418" w:left="2268" w:header="0" w:footer="0" w:gutter="0"/>
           <w:pgNumType w:start="1"/>
@@ -895,19 +896,59 @@
       <w:bookmarkEnd w:id="9"/>
       <w:bookmarkEnd w:id="10"/>
     </w:p>
+    <w:p/>
+    <w:p/>
+    <w:p/>
     <w:p>
+      <w:pPr>
+        <w:rPr>
+          <w:i/>
+          <w:iCs/>
+        </w:rPr>
+      </w:pPr>
       <w:r>
+        <w:rPr>
+          <w:i/>
+          <w:iCs/>
+        </w:rPr>
         <w:t>Dedico este proyecto con profundo amor y gratitud a mi esposa Andrea, compañera de vida, quien con paciencia infinita, cariño constante y apoyo incondicional fue mi refugio y fortaleza en cada paso dado durante estos años de esfuerzo.</w:t>
       </w:r>
     </w:p>
     <w:p>
+      <w:pPr>
+        <w:rPr>
+          <w:i/>
+          <w:iCs/>
+        </w:rPr>
+      </w:pPr>
       <w:r>
+        <w:rPr>
+          <w:i/>
+          <w:iCs/>
+        </w:rPr>
         <w:t>A mis queridos hijos, Nicolás y Martina, fuente inagotable de alegría, ternura y energía; gracias por ser la luz que ilumina mi camino y la razón más profunda detrás de cada meta que emprendo.</w:t>
       </w:r>
     </w:p>
-    <w:p/>
     <w:p>
+      <w:pPr>
+        <w:rPr>
+          <w:i/>
+          <w:iCs/>
+        </w:rPr>
+      </w:pPr>
+    </w:p>
+    <w:p>
+      <w:pPr>
+        <w:rPr>
+          <w:i/>
+          <w:iCs/>
+        </w:rPr>
+      </w:pPr>
       <w:r>
+        <w:rPr>
+          <w:i/>
+          <w:iCs/>
+        </w:rPr>
         <w:t>A ustedes, con todo mi corazón.</w:t>
       </w:r>
     </w:p>
@@ -990,10 +1031,11 @@
       </w:r>
     </w:p>
     <w:sectPr>
-      <w:headerReference w:type="default" r:id="rId9"/>
-      <w:footerReference w:type="default" r:id="rId10"/>
+      <w:headerReference w:type="default" r:id="rId10"/>
+      <w:footerReference w:type="default" r:id="rId11"/>
       <w:pgSz w:w="12240" w:h="15840"/>
       <w:pgMar w:top="1560" w:right="1418" w:bottom="1418" w:left="2268" w:header="0" w:footer="709" w:gutter="0"/>
+      <w:pgNumType w:fmt="lowerRoman"/>
       <w:cols w:space="720"/>
     </w:sectPr>
   </w:body>
@@ -1027,6 +1069,117 @@
 
 <file path=word/footer1.xml><?xml version="1.0" encoding="utf-8"?>
 <w:ftr xmlns:wpc="http://schemas.microsoft.com/office/word/2010/wordprocessingCanvas" xmlns:cx="http://schemas.microsoft.com/office/drawing/2014/chartex" xmlns:cx1="http://schemas.microsoft.com/office/drawing/2015/9/8/chartex" xmlns:cx2="http://schemas.microsoft.com/office/drawing/2015/10/21/chartex" xmlns:cx3="http://schemas.microsoft.com/office/drawing/2016/5/9/chartex" xmlns:cx4="http://schemas.microsoft.com/office/drawing/2016/5/10/chartex" xmlns:cx5="http://schemas.microsoft.com/office/drawing/2016/5/11/chartex" xmlns:cx6="http://schemas.microsoft.com/office/drawing/2016/5/12/chartex" xmlns:cx7="http://schemas.microsoft.com/office/drawing/2016/5/13/chartex" xmlns:cx8="http://schemas.microsoft.com/office/drawing/2016/5/14/chartex" xmlns:mc="http://schemas.openxmlformats.org/markup-compatibility/2006" xmlns:aink="http://schemas.microsoft.com/office/drawing/2016/ink" xmlns:am3d="http://schemas.microsoft.com/office/drawing/2017/model3d" xmlns:o="urn:schemas-microsoft-com:office:office" xmlns:oel="http://schemas.microsoft.com/office/2019/extlst" xmlns:r="http://schemas.openxmlformats.org/officeDocument/2006/relationships" xmlns:m="http://schemas.openxmlformats.org/officeDocument/2006/math" xmlns:v="urn:schemas-microsoft-com:vml" xmlns:wp14="http://schemas.microsoft.com/office/word/2010/wordprocessingDrawing" xmlns:wp="http://schemas.openxmlformats.org/drawingml/2006/wordprocessingDrawing" xmlns:w10="urn:schemas-microsoft-com:office:word" xmlns:w="http://schemas.openxmlformats.org/wordprocessingml/2006/main" xmlns:w14="http://schemas.microsoft.com/office/word/2010/wordml" xmlns:w15="http://schemas.microsoft.com/office/word/2012/wordml" xmlns:w16cex="http://schemas.microsoft.com/office/word/2018/wordml/cex" xmlns:w16cid="http://schemas.microsoft.com/office/word/2016/wordml/cid" xmlns:w16="http://schemas.microsoft.com/office/word/2018/wordml" xmlns:w16du="http://schemas.microsoft.com/office/word/2023/wordml/word16du" xmlns:w16sdtdh="http://schemas.microsoft.com/office/word/2020/wordml/sdtdatahash" xmlns:w16sdtfl="http://schemas.microsoft.com/office/word/2024/wordml/sdtformatlock" xmlns:w16se="http://schemas.microsoft.com/office/word/2015/wordml/symex" xmlns:wpg="http://schemas.microsoft.com/office/word/2010/wordprocessingGroup" xmlns:wpi="http://schemas.microsoft.com/office/word/2010/wordprocessingInk" xmlns:wne="http://schemas.microsoft.com/office/word/2006/wordml" xmlns:wps="http://schemas.microsoft.com/office/word/2010/wordprocessingShape" mc:Ignorable="w14 w15 w16se w16cid w16 w16cex w16sdtdh w16sdtfl w16du wp14">
+  <w:sdt>
+    <w:sdtPr>
+      <w:rPr>
+        <w:rStyle w:val="PageNumber"/>
+      </w:rPr>
+      <w:id w:val="-802239392"/>
+      <w:docPartObj>
+        <w:docPartGallery w:val="Page Numbers (Bottom of Page)"/>
+        <w:docPartUnique/>
+      </w:docPartObj>
+    </w:sdtPr>
+    <w:sdtContent>
+      <w:p>
+        <w:pPr>
+          <w:pStyle w:val="Footer"/>
+          <w:framePr w:wrap="none" w:vAnchor="text" w:hAnchor="margin" w:xAlign="center" w:y="1"/>
+          <w:rPr>
+            <w:rStyle w:val="PageNumber"/>
+          </w:rPr>
+        </w:pPr>
+        <w:r>
+          <w:rPr>
+            <w:rStyle w:val="PageNumber"/>
+          </w:rPr>
+          <w:fldChar w:fldCharType="begin"/>
+        </w:r>
+        <w:r>
+          <w:rPr>
+            <w:rStyle w:val="PageNumber"/>
+          </w:rPr>
+          <w:instrText xml:space="preserve"> PAGE </w:instrText>
+        </w:r>
+        <w:r>
+          <w:rPr>
+            <w:rStyle w:val="PageNumber"/>
+          </w:rPr>
+          <w:fldChar w:fldCharType="separate"/>
+        </w:r>
+        <w:r>
+          <w:rPr>
+            <w:rStyle w:val="PageNumber"/>
+          </w:rPr>
+          <w:fldChar w:fldCharType="end"/>
+        </w:r>
+      </w:p>
+    </w:sdtContent>
+  </w:sdt>
+  <w:p>
+    <w:pPr>
+      <w:pStyle w:val="Footer"/>
+    </w:pPr>
+  </w:p>
+</w:ftr>
+</file>
+
+<file path=word/footer2.xml><?xml version="1.0" encoding="utf-8"?>
+<w:ftr xmlns:wpc="http://schemas.microsoft.com/office/word/2010/wordprocessingCanvas" xmlns:cx="http://schemas.microsoft.com/office/drawing/2014/chartex" xmlns:cx1="http://schemas.microsoft.com/office/drawing/2015/9/8/chartex" xmlns:cx2="http://schemas.microsoft.com/office/drawing/2015/10/21/chartex" xmlns:cx3="http://schemas.microsoft.com/office/drawing/2016/5/9/chartex" xmlns:cx4="http://schemas.microsoft.com/office/drawing/2016/5/10/chartex" xmlns:cx5="http://schemas.microsoft.com/office/drawing/2016/5/11/chartex" xmlns:cx6="http://schemas.microsoft.com/office/drawing/2016/5/12/chartex" xmlns:cx7="http://schemas.microsoft.com/office/drawing/2016/5/13/chartex" xmlns:cx8="http://schemas.microsoft.com/office/drawing/2016/5/14/chartex" xmlns:mc="http://schemas.openxmlformats.org/markup-compatibility/2006" xmlns:aink="http://schemas.microsoft.com/office/drawing/2016/ink" xmlns:am3d="http://schemas.microsoft.com/office/drawing/2017/model3d" xmlns:o="urn:schemas-microsoft-com:office:office" xmlns:oel="http://schemas.microsoft.com/office/2019/extlst" xmlns:r="http://schemas.openxmlformats.org/officeDocument/2006/relationships" xmlns:m="http://schemas.openxmlformats.org/officeDocument/2006/math" xmlns:v="urn:schemas-microsoft-com:vml" xmlns:wp14="http://schemas.microsoft.com/office/word/2010/wordprocessingDrawing" xmlns:wp="http://schemas.openxmlformats.org/drawingml/2006/wordprocessingDrawing" xmlns:w10="urn:schemas-microsoft-com:office:word" xmlns:w="http://schemas.openxmlformats.org/wordprocessingml/2006/main" xmlns:w14="http://schemas.microsoft.com/office/word/2010/wordml" xmlns:w15="http://schemas.microsoft.com/office/word/2012/wordml" xmlns:w16cex="http://schemas.microsoft.com/office/word/2018/wordml/cex" xmlns:w16cid="http://schemas.microsoft.com/office/word/2016/wordml/cid" xmlns:w16="http://schemas.microsoft.com/office/word/2018/wordml" xmlns:w16du="http://schemas.microsoft.com/office/word/2023/wordml/word16du" xmlns:w16sdtdh="http://schemas.microsoft.com/office/word/2020/wordml/sdtdatahash" xmlns:w16sdtfl="http://schemas.microsoft.com/office/word/2024/wordml/sdtformatlock" xmlns:w16se="http://schemas.microsoft.com/office/word/2015/wordml/symex" xmlns:wpg="http://schemas.microsoft.com/office/word/2010/wordprocessingGroup" xmlns:wpi="http://schemas.microsoft.com/office/word/2010/wordprocessingInk" xmlns:wne="http://schemas.microsoft.com/office/word/2006/wordml" xmlns:wps="http://schemas.microsoft.com/office/word/2010/wordprocessingShape" mc:Ignorable="w14 w15 w16se w16cid w16 w16cex w16sdtdh w16sdtfl w16du wp14">
+  <w:sdt>
+    <w:sdtPr>
+      <w:rPr>
+        <w:rStyle w:val="PageNumber"/>
+      </w:rPr>
+      <w:id w:val="-1829812591"/>
+      <w:docPartObj>
+        <w:docPartGallery w:val="Page Numbers (Bottom of Page)"/>
+        <w:docPartUnique/>
+      </w:docPartObj>
+    </w:sdtPr>
+    <w:sdtContent>
+      <w:p>
+        <w:pPr>
+          <w:pStyle w:val="Footer"/>
+          <w:framePr w:wrap="none" w:vAnchor="text" w:hAnchor="margin" w:xAlign="center" w:y="1"/>
+          <w:rPr>
+            <w:rStyle w:val="PageNumber"/>
+          </w:rPr>
+        </w:pPr>
+        <w:r>
+          <w:rPr>
+            <w:rStyle w:val="PageNumber"/>
+          </w:rPr>
+          <w:fldChar w:fldCharType="begin"/>
+        </w:r>
+        <w:r>
+          <w:rPr>
+            <w:rStyle w:val="PageNumber"/>
+          </w:rPr>
+          <w:instrText xml:space="preserve"> PAGE </w:instrText>
+        </w:r>
+        <w:r>
+          <w:rPr>
+            <w:rStyle w:val="PageNumber"/>
+          </w:rPr>
+          <w:fldChar w:fldCharType="separate"/>
+        </w:r>
+        <w:r>
+          <w:rPr>
+            <w:rStyle w:val="PageNumber"/>
+            <w:noProof/>
+          </w:rPr>
+          <w:t>ii</w:t>
+        </w:r>
+        <w:r>
+          <w:rPr>
+            <w:rStyle w:val="PageNumber"/>
+          </w:rPr>
+          <w:fldChar w:fldCharType="end"/>
+        </w:r>
+      </w:p>
+    </w:sdtContent>
+  </w:sdt>
   <w:p>
     <w:pPr>
       <w:pBdr>
@@ -1046,37 +1199,6 @@
         <w:color w:val="000000"/>
       </w:rPr>
     </w:pPr>
-    <w:r>
-      <w:rPr>
-        <w:color w:val="000000"/>
-      </w:rPr>
-      <w:fldChar w:fldCharType="begin"/>
-    </w:r>
-    <w:r>
-      <w:rPr>
-        <w:color w:val="000000"/>
-      </w:rPr>
-      <w:instrText>PAGE</w:instrText>
-    </w:r>
-    <w:r>
-      <w:rPr>
-        <w:color w:val="000000"/>
-      </w:rPr>
-      <w:fldChar w:fldCharType="separate"/>
-    </w:r>
-    <w:r>
-      <w:rPr>
-        <w:noProof/>
-        <w:color w:val="000000"/>
-      </w:rPr>
-      <w:t>2</w:t>
-    </w:r>
-    <w:r>
-      <w:rPr>
-        <w:color w:val="000000"/>
-      </w:rPr>
-      <w:fldChar w:fldCharType="end"/>
-    </w:r>
   </w:p>
   <w:p>
     <w:pPr>
@@ -7377,6 +7499,58 @@
       <w:shd w:val="clear" w:color="auto" w:fill="E1DFDD"/>
     </w:rPr>
   </w:style>
+  <w:style w:type="paragraph" w:styleId="Header">
+    <w:name w:val="header"/>
+    <w:basedOn w:val="Normal"/>
+    <w:link w:val="HeaderChar"/>
+    <w:uiPriority w:val="99"/>
+    <w:unhideWhenUsed/>
+    <w:rsid w:val="00F521A3"/>
+    <w:pPr>
+      <w:tabs>
+        <w:tab w:val="center" w:pos="4680"/>
+        <w:tab w:val="right" w:pos="9360"/>
+      </w:tabs>
+      <w:spacing w:after="0" w:line="240" w:lineRule="auto"/>
+    </w:pPr>
+  </w:style>
+  <w:style w:type="character" w:customStyle="1" w:styleId="HeaderChar">
+    <w:name w:val="Header Char"/>
+    <w:basedOn w:val="DefaultParagraphFont"/>
+    <w:link w:val="Header"/>
+    <w:uiPriority w:val="99"/>
+    <w:rsid w:val="00F521A3"/>
+  </w:style>
+  <w:style w:type="paragraph" w:styleId="Footer">
+    <w:name w:val="footer"/>
+    <w:basedOn w:val="Normal"/>
+    <w:link w:val="FooterChar"/>
+    <w:uiPriority w:val="99"/>
+    <w:unhideWhenUsed/>
+    <w:rsid w:val="00F521A3"/>
+    <w:pPr>
+      <w:tabs>
+        <w:tab w:val="center" w:pos="4680"/>
+        <w:tab w:val="right" w:pos="9360"/>
+      </w:tabs>
+      <w:spacing w:after="0" w:line="240" w:lineRule="auto"/>
+    </w:pPr>
+  </w:style>
+  <w:style w:type="character" w:customStyle="1" w:styleId="FooterChar">
+    <w:name w:val="Footer Char"/>
+    <w:basedOn w:val="DefaultParagraphFont"/>
+    <w:link w:val="Footer"/>
+    <w:uiPriority w:val="99"/>
+    <w:rsid w:val="00F521A3"/>
+  </w:style>
+  <w:style w:type="character" w:styleId="PageNumber">
+    <w:name w:val="page number"/>
+    <w:basedOn w:val="DefaultParagraphFont"/>
+    <w:uiPriority w:val="99"/>
+    <w:semiHidden/>
+    <w:unhideWhenUsed/>
+    <w:rsid w:val="00F521A3"/>
+  </w:style>
 </w:styles>
 </file>
 

</xml_diff>